<commit_message>
Add 3 resources (Zooniverse, Conservation X Labs, Re:wild) and expand Training Plan; regenerate DOCX\n\nCo-authored-by: Copilot <223556219+Copilot@users.noreply.github.com>
</commit_message>
<xml_diff>
--- a/Okapi_Wildlife_Reserve_Conservation_Technology_Strategy_with_resources.docx
+++ b/Okapi_Wildlife_Reserve_Conservation_Technology_Strategy_with_resources.docx
@@ -859,6 +859,196 @@
     </w:p>
     <w:p>
       <w:r>
+        <w:t>23) Zooniverse</w:t>
+      </w:r>
+    </w:p>
+    <w:p>
+      <w:r>
+        <w:t>URL: https://www.zooniverse.org</w:t>
+      </w:r>
+    </w:p>
+    <w:p>
+      <w:r>
+        <w:t>Summary: Global citizen-science platform enabling public participation in data annotation and species identification workflows; useful for scaling image/audio classification and engaging communities in verification.</w:t>
+      </w:r>
+    </w:p>
+    <w:p>
+      <w:r>
+        <w:t>24) Conservation X Labs (CXL)</w:t>
+      </w:r>
+    </w:p>
+    <w:p>
+      <w:r>
+        <w:t>URL: https://conservationxlabs.com</w:t>
+      </w:r>
+    </w:p>
+    <w:p>
+      <w:r>
+        <w:t>Summary: An innovation hub that accelerates conservation technology solutions and market-based approaches to protect ecosystems; useful for partnerships, prototyping, and tech-for-good initiatives.</w:t>
+      </w:r>
+    </w:p>
+    <w:p>
+      <w:r>
+        <w:t>25) Re:wild</w:t>
+      </w:r>
+    </w:p>
+    <w:p>
+      <w:r>
+        <w:t>URL: https://www.rewild.org</w:t>
+      </w:r>
+    </w:p>
+    <w:p>
+      <w:r>
+        <w:t>Summary: Global conservation organization focused on species recovery and landscape-scale protection; a partner and funder resource for large-scale conservation projects.</w:t>
+      </w:r>
+    </w:p>
+    <w:p>
+      <w:r>
+        <w:t>9. Expanded Training Plan (OWR Conservation Technology Capacity Building)</w:t>
+      </w:r>
+    </w:p>
+    <w:p>
+      <w:r>
+        <w:t>Objectives</w:t>
+      </w:r>
+    </w:p>
+    <w:p>
+      <w:r>
+        <w:t>- Equip ranger teams, CCOPS staff, and community monitors with practical skills to operate, maintain, and troubleshoot deployed hardware and software.</w:t>
+      </w:r>
+    </w:p>
+    <w:p>
+      <w:r>
+        <w:t>- Build local trainers to sustain systems and reduce external dependence.</w:t>
+      </w:r>
+    </w:p>
+    <w:p>
+      <w:r>
+        <w:t>- Improve data quality, timeliness, and analytic capacity for evidence-based decisions.</w:t>
+      </w:r>
+    </w:p>
+    <w:p>
+      <w:r>
+        <w:t>Curriculum Modules</w:t>
+      </w:r>
+    </w:p>
+    <w:p>
+      <w:r>
+        <w:t>- Device operation &amp; field best-practices: Garmin devices, rugged smartphones, camera trap deployment, acoustic recorder handling, power management.</w:t>
+      </w:r>
+    </w:p>
+    <w:p>
+      <w:r>
+        <w:t>- SMART / CyberTracker mobile workflows: form design, offline sync, QA checks, incident reporting.</w:t>
+      </w:r>
+    </w:p>
+    <w:p>
+      <w:r>
+        <w:t>- EarthRanger &amp; CCOPS dashboard use: live monitoring, incident triage, sensor integration, alerting.</w:t>
+      </w:r>
+    </w:p>
+    <w:p>
+      <w:r>
+        <w:t>- Camera trap &amp; Wildlife Insights pipeline: deployment protocols, image management, basic AI review and validation.</w:t>
+      </w:r>
+    </w:p>
+    <w:p>
+      <w:r>
+        <w:t>- Acoustic &amp; eDNA basics: deployment, sample chain-of-custody, metadata standards.</w:t>
+      </w:r>
+    </w:p>
+    <w:p>
+      <w:r>
+        <w:t>- Data governance, metadata, and open-data practices: TDWG standards, data licensing, sensitive data handling.</w:t>
+      </w:r>
+    </w:p>
+    <w:p>
+      <w:r>
+        <w:t>- GIS &amp; dashboard storytelling: basic QGIS/ArcGIS Online tasks, map creation, and preparing story maps for stakeholders.</w:t>
+      </w:r>
+    </w:p>
+    <w:p>
+      <w:r>
+        <w:t>Training Approach</w:t>
+      </w:r>
+    </w:p>
+    <w:p>
+      <w:r>
+        <w:t>- Phase 1: Intensive 10-day in-person bootcamps for core staff (rangers, CCOPS, data team).</w:t>
+      </w:r>
+    </w:p>
+    <w:p>
+      <w:r>
+        <w:t>- Phase 2: Two-week field mentorships pairing local trainers with teams during routine patrols and sensor deployments.</w:t>
+      </w:r>
+    </w:p>
+    <w:p>
+      <w:r>
+        <w:t>- Phase 3: "Train-the-Trainer" certification: select 8–10 local staff for trainer certification and refresher schedule.</w:t>
+      </w:r>
+    </w:p>
+    <w:p>
+      <w:r>
+        <w:t>- Continuous: Quarterly remote refresher workshops and annual assessment exercises.</w:t>
+      </w:r>
+    </w:p>
+    <w:p>
+      <w:r>
+        <w:t>Assessment &amp; KPIs</w:t>
+      </w:r>
+    </w:p>
+    <w:p>
+      <w:r>
+        <w:t>- # staff trained and certified (target: 100% of ranger teams trained by end of Phase 1).</w:t>
+      </w:r>
+    </w:p>
+    <w:p>
+      <w:r>
+        <w:t>- Data latency reduction (target: 80% of patrol reports ingested digitally within 24 hours).</w:t>
+      </w:r>
+    </w:p>
+    <w:p>
+      <w:r>
+        <w:t>- Data quality metrics: percentage of complete records, GPS accuracy, correct species IDs after AI validation.</w:t>
+      </w:r>
+    </w:p>
+    <w:p>
+      <w:r>
+        <w:t>Budget &amp; Resources (high-level)</w:t>
+      </w:r>
+    </w:p>
+    <w:p>
+      <w:r>
+        <w:t>- Training materials, translation/localization, per diems, and travel for trainers.</w:t>
+      </w:r>
+    </w:p>
+    <w:p>
+      <w:r>
+        <w:t>- Spare hardware kit per team (batteries, SD cards, charging banks, spare sensors).</w:t>
+      </w:r>
+    </w:p>
+    <w:p>
+      <w:r>
+        <w:t>- Modest budget for cloud processing credits (Wildlife Insights, GFW alerts) and internet connectivity at CCOPS.</w:t>
+      </w:r>
+    </w:p>
+    <w:p>
+      <w:r>
+        <w:t>Next steps (updated)</w:t>
+      </w:r>
+    </w:p>
+    <w:p>
+      <w:r>
+        <w:t>- Append three new resources and training plan into the DOCX.</w:t>
+      </w:r>
+    </w:p>
+    <w:p>
+      <w:r>
+        <w:t>- Regenerate Word doc and commit the updated files.</w:t>
+      </w:r>
+    </w:p>
+    <w:p>
+      <w:r>
         <w:t>(End of draft)</w:t>
       </w:r>
     </w:p>

</xml_diff>